<commit_message>
Modified both First and Second File
</commit_message>
<xml_diff>
--- a/First Document.docx
+++ b/First Document.docx
@@ -5,6 +5,11 @@
     <w:p>
       <w:r>
         <w:t>Code Developed at 4:28PM</w:t>
+      </w:r>
+    </w:p>
+    <w:p>
+      <w:r>
+        <w:t>Code Updated at 4:44PM</w:t>
       </w:r>
     </w:p>
     <w:p/>

</xml_diff>